<commit_message>
docs: sync all report documents and PDF submission file
</commit_message>
<xml_diff>
--- a/P02_MEDIFLOW_REPORT_ADSE.docx
+++ b/P02_MEDIFLOW_REPORT_ADSE.docx
@@ -444,13 +444,6 @@
               </w:rPr>
               <w:t xml:space="preserve"> </w:t>
             </w:r>
-            <w:r>
-              <w:rPr>
-                <w:rFonts w:ascii="Times New Roman" w:hAnsi="Times New Roman" w:cs="Times New Roman"/>
-                <w:i/>
-              </w:rPr>
-              <w:t>(Lead)</w:t>
-            </w:r>
           </w:p>
         </w:tc>
         <w:tc>
@@ -2023,7 +2016,6 @@
                 <w:sz w:val="17"/>
               </w:rPr>
               <w:br/>
-              <w:t>└────────────────────────────────────┬────────────────────────────────────┘</w:t>
             </w:r>
             <w:r>
               <w:rPr>
@@ -2031,6 +2023,14 @@
                 <w:color w:val="1E293B"/>
                 <w:sz w:val="17"/>
               </w:rPr>
+              <w:t>└────────────────────────────────────┬────────────────────────────────────┘</w:t>
+            </w:r>
+            <w:r>
+              <w:rPr>
+                <w:rFonts w:ascii="Times New Roman" w:hAnsi="Times New Roman" w:cs="Times New Roman"/>
+                <w:color w:val="1E293B"/>
+                <w:sz w:val="17"/>
+              </w:rPr>
               <w:br/>
               <w:t xml:space="preserve">                                     │ HTTPS / RESTful JSON</w:t>
             </w:r>
@@ -2077,7 +2077,6 @@
                 <w:sz w:val="17"/>
               </w:rPr>
               <w:br/>
-              <w:t>│   • CORS &amp; Helmet Security Headers                                      │</w:t>
             </w:r>
             <w:r>
               <w:rPr>
@@ -2085,6 +2084,14 @@
                 <w:color w:val="1E293B"/>
                 <w:sz w:val="17"/>
               </w:rPr>
+              <w:t>│   • CORS &amp; Helmet Security Headers                                      │</w:t>
+            </w:r>
+            <w:r>
+              <w:rPr>
+                <w:rFonts w:ascii="Times New Roman" w:hAnsi="Times New Roman" w:cs="Times New Roman"/>
+                <w:color w:val="1E293B"/>
+                <w:sz w:val="17"/>
+              </w:rPr>
               <w:br/>
               <w:t>│   • Express-Validator Request Sanitization                              │</w:t>
             </w:r>
@@ -2131,7 +2138,6 @@
                 <w:sz w:val="17"/>
               </w:rPr>
               <w:br/>
-              <w:t>│   • Auth &amp; Patient Controller        • Appointment Booking Engine       │</w:t>
             </w:r>
             <w:r>
               <w:rPr>
@@ -2139,6 +2145,14 @@
                 <w:color w:val="1E293B"/>
                 <w:sz w:val="17"/>
               </w:rPr>
+              <w:t>│   • Auth &amp; Patient Controller        • Appointment Booking Engine       │</w:t>
+            </w:r>
+            <w:r>
+              <w:rPr>
+                <w:rFonts w:ascii="Times New Roman" w:hAnsi="Times New Roman" w:cs="Times New Roman"/>
+                <w:color w:val="1E293B"/>
+                <w:sz w:val="17"/>
+              </w:rPr>
               <w:br/>
               <w:t>│   • Doctor &amp; Department Controller   • Clinical Prescription Service    │</w:t>
             </w:r>
@@ -2193,6 +2207,13 @@
                 <w:sz w:val="17"/>
               </w:rPr>
               <w:br/>
+            </w:r>
+            <w:r>
+              <w:rPr>
+                <w:rFonts w:ascii="Times New Roman" w:hAnsi="Times New Roman" w:cs="Times New Roman"/>
+                <w:color w:val="1E293B"/>
+                <w:sz w:val="17"/>
+              </w:rPr>
               <w:t xml:space="preserve">                                     │ Mongoose ODM (Queries &amp; Aggregations)</w:t>
             </w:r>
             <w:r>
@@ -2332,7 +2353,6 @@
                 <w:sz w:val="17"/>
               </w:rPr>
               <w:br/>
-              <w:t>│   ├── config/             # MongoDB connection, env loader</w:t>
             </w:r>
             <w:r>
               <w:rPr>
@@ -2340,6 +2360,14 @@
                 <w:color w:val="1E293B"/>
                 <w:sz w:val="17"/>
               </w:rPr>
+              <w:t>│   ├── config/             # MongoDB connection, env loader</w:t>
+            </w:r>
+            <w:r>
+              <w:rPr>
+                <w:rFonts w:ascii="Times New Roman" w:hAnsi="Times New Roman" w:cs="Times New Roman"/>
+                <w:color w:val="1E293B"/>
+                <w:sz w:val="17"/>
+              </w:rPr>
               <w:br/>
               <w:t>│   ├── constants/          # Role enums, appointment statuses</w:t>
             </w:r>
@@ -2395,7 +2423,6 @@
                 <w:sz w:val="17"/>
               </w:rPr>
               <w:br/>
-              <w:t>│   ├── seed/               # Deterministic demo seed script (12 doctors, appointments)</w:t>
             </w:r>
             <w:r>
               <w:rPr>
@@ -2403,6 +2430,14 @@
                 <w:color w:val="1E293B"/>
                 <w:sz w:val="17"/>
               </w:rPr>
+              <w:t>│   ├── seed/               # Deterministic demo seed script (12 doctors, appointments)</w:t>
+            </w:r>
+            <w:r>
+              <w:rPr>
+                <w:rFonts w:ascii="Times New Roman" w:hAnsi="Times New Roman" w:cs="Times New Roman"/>
+                <w:color w:val="1E293B"/>
+                <w:sz w:val="17"/>
+              </w:rPr>
               <w:br/>
               <w:t>│   ├── services/           # Reusable business logic &amp; aggregation pipelines</w:t>
             </w:r>
@@ -2449,6 +2484,13 @@
                 <w:sz w:val="17"/>
               </w:rPr>
               <w:br/>
+            </w:r>
+            <w:r>
+              <w:rPr>
+                <w:rFonts w:ascii="Times New Roman" w:hAnsi="Times New Roman" w:cs="Times New Roman"/>
+                <w:color w:val="1E293B"/>
+                <w:sz w:val="17"/>
+              </w:rPr>
               <w:t>├── postman/                # Exported Postman collection &amp; environment</w:t>
             </w:r>
             <w:r>
@@ -3459,7 +3501,6 @@
                 <w:sz w:val="17"/>
               </w:rPr>
               <w:br/>
-              <w:t>userSchema.index({ email: 1 }, { unique: true });</w:t>
             </w:r>
             <w:r>
               <w:rPr>
@@ -3467,7 +3508,7 @@
                 <w:color w:val="1E293B"/>
                 <w:sz w:val="17"/>
               </w:rPr>
-              <w:br/>
+              <w:t>userSchema.index({ email: 1 }, { unique: true });</w:t>
             </w:r>
             <w:r>
               <w:rPr>
@@ -3476,7 +3517,6 @@
                 <w:sz w:val="17"/>
               </w:rPr>
               <w:br/>
-              <w:t>// 2. patients &amp; doctors: Fast reference lookup</w:t>
             </w:r>
             <w:r>
               <w:rPr>
@@ -3485,7 +3525,7 @@
                 <w:sz w:val="17"/>
               </w:rPr>
               <w:br/>
-              <w:t>patientSchema.index({ userId: 1 }, { unique: true });</w:t>
+              <w:t>// 2. patients &amp; doctors: Fast reference lookup</w:t>
             </w:r>
             <w:r>
               <w:rPr>
@@ -3494,7 +3534,7 @@
                 <w:sz w:val="17"/>
               </w:rPr>
               <w:br/>
-              <w:t>doctorSchema.index({ userId: 1 }, { unique: true });</w:t>
+              <w:t>patientSchema.index({ userId: 1 }, { unique: true });</w:t>
             </w:r>
             <w:r>
               <w:rPr>
@@ -3503,7 +3543,7 @@
                 <w:sz w:val="17"/>
               </w:rPr>
               <w:br/>
-              <w:t>doctorSchema.index({ departmentId: 1, isActive: 1 });</w:t>
+              <w:t>doctorSchema.index({ userId: 1 }, { unique: true });</w:t>
             </w:r>
             <w:r>
               <w:rPr>
@@ -3512,6 +3552,7 @@
                 <w:sz w:val="17"/>
               </w:rPr>
               <w:br/>
+              <w:t>doctorSchema.index({ departmentId: 1, isActive: 1 });</w:t>
             </w:r>
             <w:r>
               <w:rPr>
@@ -3520,7 +3561,6 @@
                 <w:sz w:val="17"/>
               </w:rPr>
               <w:br/>
-              <w:t>// 3. appointments: Sparse unique index to physically eliminate double booking</w:t>
             </w:r>
             <w:r>
               <w:rPr>
@@ -3529,7 +3569,7 @@
                 <w:sz w:val="17"/>
               </w:rPr>
               <w:br/>
-              <w:t>appointmentSchema.index({ slotKey: 1 }, { unique: true, sparse: true });</w:t>
+              <w:t>// 3. appointments: Sparse unique index to physically eliminate double booking</w:t>
             </w:r>
             <w:r>
               <w:rPr>
@@ -3538,7 +3578,7 @@
                 <w:sz w:val="17"/>
               </w:rPr>
               <w:br/>
-              <w:t>appointmentSchema.index({ doctorId: 1, date: 1, status: 1 });</w:t>
+              <w:t>appointmentSchema.index({ slotKey: 1 }, { unique: true, sparse: true });</w:t>
             </w:r>
             <w:r>
               <w:rPr>
@@ -3547,6 +3587,22 @@
                 <w:sz w:val="17"/>
               </w:rPr>
               <w:br/>
+              <w:t>appointmentSchema.index({ doctorId: 1, date: 1, status: 1 });</w:t>
+            </w:r>
+            <w:r>
+              <w:rPr>
+                <w:rFonts w:ascii="Times New Roman" w:hAnsi="Times New Roman" w:cs="Times New Roman"/>
+                <w:color w:val="1E293B"/>
+                <w:sz w:val="17"/>
+              </w:rPr>
+              <w:br/>
+            </w:r>
+            <w:r>
+              <w:rPr>
+                <w:rFonts w:ascii="Times New Roman" w:hAnsi="Times New Roman" w:cs="Times New Roman"/>
+                <w:color w:val="1E293B"/>
+                <w:sz w:val="17"/>
+              </w:rPr>
               <w:t>appointmentSchema.index({ patientId: 1, date: 1, status: 1 });</w:t>
             </w:r>
             <w:r>
@@ -5407,7 +5463,6 @@
                 <w:sz w:val="17"/>
               </w:rPr>
               <w:br/>
-              <w:t>PASS tests/workflow.test.js         (8/8 tests)    - State machine transitions &amp; invalid state rejections</w:t>
             </w:r>
             <w:r>
               <w:rPr>
@@ -5415,6 +5470,14 @@
                 <w:color w:val="1E293B"/>
                 <w:sz w:val="17"/>
               </w:rPr>
+              <w:t>PASS tests/workflow.test.js         (8/8 tests)    - State machine transitions &amp; invalid state rejections</w:t>
+            </w:r>
+            <w:r>
+              <w:rPr>
+                <w:rFonts w:ascii="Times New Roman" w:hAnsi="Times New Roman" w:cs="Times New Roman"/>
+                <w:color w:val="1E293B"/>
+                <w:sz w:val="17"/>
+              </w:rPr>
               <w:br/>
               <w:t>PASS tests/appointment.test.js      (12/12 tests)  - Double booking, interval conflict checks</w:t>
             </w:r>
@@ -5452,7 +5515,6 @@
                 <w:sz w:val="17"/>
               </w:rPr>
               <w:br/>
-              <w:t>PASS tests/integration.test.js      (8/8 tests)    - Complete end-to-end user journeys</w:t>
             </w:r>
             <w:r>
               <w:rPr>
@@ -5460,6 +5522,14 @@
                 <w:color w:val="1E293B"/>
                 <w:sz w:val="17"/>
               </w:rPr>
+              <w:t>PASS tests/integration.test.js      (8/8 tests)    - Complete end-to-end user journeys</w:t>
+            </w:r>
+            <w:r>
+              <w:rPr>
+                <w:rFonts w:ascii="Times New Roman" w:hAnsi="Times New Roman" w:cs="Times New Roman"/>
+                <w:color w:val="1E293B"/>
+                <w:sz w:val="17"/>
+              </w:rPr>
               <w:br/>
               <w:t>PASS tests/auth.test.js             (8/8 tests)    - JWT login, registration, invalid credentials</w:t>
             </w:r>
@@ -5522,6 +5592,13 @@
                 <w:sz w:val="17"/>
               </w:rPr>
               <w:br/>
+            </w:r>
+            <w:r>
+              <w:rPr>
+                <w:rFonts w:ascii="Times New Roman" w:hAnsi="Times New Roman" w:cs="Times New Roman"/>
+                <w:color w:val="1E293B"/>
+                <w:sz w:val="17"/>
+              </w:rPr>
               <w:t>Tests:       99 passed, 99 total</w:t>
             </w:r>
             <w:r>

</xml_diff>